<commit_message>
fix: validate max length of text fields to return 400 instead of 500 (H-2)
</commit_message>
<xml_diff>
--- a/docs/test-notu-T06.docx
+++ b/docs/test-notu-T06.docx
@@ -1261,7 +1261,7 @@
           </w:tcPr>
           <w:p>
             <w:r>
-              <w:t>Gerçekleşen</w:t>
+              <w:t>Gerçekleşen (ilk)</w:t>
             </w:r>
           </w:p>
         </w:tc>
@@ -1315,26 +1315,23 @@
           </w:tcPr>
           <w:p>
             <w:r>
-              <w:t>AÇIK — DTO'lara alan uzunluğu doğrulaması (@Size) eklenerek 400'e çevrilecek</w:t>
+              <w:t>DÜZELTİLDİ — DTO alanlarına @Size (255/1000/2000) eklendi; artık 400 VALIDATION_ERROR + alan bilgisi döner</w:t>
             </w:r>
           </w:p>
         </w:tc>
       </w:tr>
     </w:tbl>
     <w:p>
+      <w:r>
+        <w:t>Düzeltme: İstek DTO'larındaki metin alanlarına, veritabanı kolon uzunluklarıyla eşleşen @Size kuralları eklendi. Canlı olarak doğrulandı (2500 karakterlik alan -&gt; 400).</w:t>
+      </w:r>
+    </w:p>
+    <w:p>
       <w:pPr>
         <w:pStyle w:val="Heading1"/>
       </w:pPr>
       <w:r>
         <w:t>5. Kalan riskler</w:t>
-      </w:r>
-    </w:p>
-    <w:p>
-      <w:pPr>
-        <w:pStyle w:val="ListBullet"/>
-      </w:pPr>
-      <w:r>
-        <w:t>Uzun metin alanları için giriş doğrulaması henüz yok (H-2). Sonraki adımda @Size ile temiz 400 hatasına çevrilecek.</w:t>
       </w:r>
     </w:p>
     <w:p>
@@ -1363,7 +1360,7 @@
     </w:p>
     <w:p>
       <w:r>
-        <w:t>T06 kapsamındaki iş kalemi ve durum akışı çalışır ve test edilmiş durumdadır. 32 otomatik test ve 14 canlı senaryo başarıyla geçmektedir. Review sırasında iki hata bulundu; biri düzeltildi (H-1), diğeri (H-2) kalan risk olarak kaydedildi ve sonraki adımda giderilecektir.</w:t>
+        <w:t>T06 kapsamındaki iş kalemi ve durum akışı çalışır ve test edilmiş durumdadır. 32 otomatik test ve 14 canlı senaryo başarıyla geçmektedir. Review sırasında bulunan iki hatanın (H-1 proje silme, H-2 uzun metin) ikisi de düzeltilmiş ve doğrulanmıştır.</w:t>
       </w:r>
     </w:p>
     <w:sectPr>

</xml_diff>